<commit_message>
feat: improve home dashboard interactions
</commit_message>
<xml_diff>
--- a/docs/Life_Pilot_使用者操作說明.docx
+++ b/docs/Life_Pilot_使用者操作說明.docx
@@ -5511,6 +5511,64 @@
         <w:t>三個區塊的筆數會隨搜尋結果更新，整個視窗仍只有最外層一個捲動區。</w:t>
       </w:r>
     </w:p>
+    <w:p>
+      <w:pPr>
+        <w:pStyle w:val="21"/>
+      </w:pPr>
+      <w:r>
+        <w:t>行事曆事件與記帳帳戶連結</w:t>
+      </w:r>
+    </w:p>
+    <w:p>
+      <w:r>
+        <w:t>從首頁或行事曆完成事件並記帳後，Life Pilot 會記住該筆事件最近一次使用的記帳帳戶。之後在行事曆再次點選事件旁的 Coin 圖示，會直接開啟該帳戶的新增明細畫面，不必重新選擇帳戶。</w:t>
+      </w:r>
+    </w:p>
+    <w:p>
+      <w:pPr>
+        <w:pStyle w:val="a0"/>
+      </w:pPr>
+      <w:r>
+        <w:t>同一事件若曾記到不同帳戶，系統會開啟最近一次使用的帳戶。</w:t>
+      </w:r>
+    </w:p>
+    <w:p>
+      <w:pPr>
+        <w:pStyle w:val="a0"/>
+      </w:pPr>
+      <w:r>
+        <w:t>本機模式與雲端模式都適用；關聯會跟著記帳明細儲存在目前選用的位置。</w:t>
+      </w:r>
+    </w:p>
+    <w:p>
+      <w:pPr>
+        <w:pStyle w:val="a0"/>
+      </w:pPr>
+      <w:r>
+        <w:t>若事件從未記帳、舊明細沒有事件關聯，或原帳戶已刪除，系統才會再次要求選擇帳戶。</w:t>
+      </w:r>
+    </w:p>
+    <w:p>
+      <w:pPr>
+        <w:pStyle w:val="a0"/>
+      </w:pPr>
+      <w:r>
+        <w:t>從首頁把推薦活動或推薦景點加入行事曆時，第一次加入也會先顯示確認視窗；按取消不會新增。</w:t>
+      </w:r>
+    </w:p>
+    <w:p>
+      <w:pPr>
+        <w:pStyle w:val="21"/>
+      </w:pPr>
+      <w:r>
+        <w:t>首頁帳戶選單顯示</w:t>
+      </w:r>
+    </w:p>
+    <w:p>
+      <w:r>
+        <w:t>首頁記帳與積分卡片會依實際可用寬度排列標題、加號與帳戶選單。放得下時維持同一列；放不下時才把操作列移到標題下方。帳戶名稱可辨識至少約八個英文字母，標題會完整顯示，不使用刪節號。推薦活動與推薦景點的標題和城市選擇也採用相同規則，手機與 Web 行為一致。</w:t>
+      </w:r>
+    </w:p>
     <w:sectPr>
       <w:footerReference w:type="default" r:id="rId8"/>
       <w:pgSz w:w="12240" w:h="15840"/>

</xml_diff>

<commit_message>
feat: collapse home dashboard sections
</commit_message>
<xml_diff>
--- a/docs/Life_Pilot_使用者操作說明.docx
+++ b/docs/Life_Pilot_使用者操作說明.docx
@@ -5568,6 +5568,573 @@
       <w:r>
         <w:t>首頁記帳與積分卡片會依實際可用寬度排列標題、加號與帳戶選單。放得下時維持同一列；放不下時才把操作列移到標題下方。帳戶名稱可辨識至少約八個英文字母，標題會完整顯示，不使用刪節號。推薦活動與推薦景點的標題和城市選擇也採用相同規則，手機與 Web 行為一致。</w:t>
       </w:r>
+      <w:r>
+        <w:br w:type="page"/>
+      </w:r>
+    </w:p>
+    <w:p>
+      <w:pPr>
+        <w:pStyle w:val="1"/>
+      </w:pPr>
+      <w:r>
+        <w:t>2026 年 9 月推薦內容與行程串接更新</w:t>
+      </w:r>
+    </w:p>
+    <w:p>
+      <w:pPr>
+        <w:spacing w:after="160"/>
+      </w:pPr>
+      <w:r>
+        <w:t>本章說明如何從首頁、推薦活動與推薦景點加入單日行程，以及完成行程時一併建立回憶、收支與積分紀錄。</w:t>
+      </w:r>
+    </w:p>
+    <w:p>
+      <w:pPr>
+        <w:pStyle w:val="21"/>
+      </w:pPr>
+      <w:r>
+        <w:t>從推薦內容加入行事曆</w:t>
+      </w:r>
+    </w:p>
+    <w:p>
+      <w:pPr>
+        <w:pStyle w:val="a0"/>
+        <w:spacing w:after="80"/>
+      </w:pPr>
+      <w:r>
+        <w:t>首頁、推薦活動頁與推薦景點頁都會在加入前顯示確認視窗，不會只因勾選或點擊就直接建立行程。</w:t>
+      </w:r>
+    </w:p>
+    <w:p>
+      <w:pPr>
+        <w:pStyle w:val="a0"/>
+        <w:spacing w:after="80"/>
+      </w:pPr>
+      <w:r>
+        <w:t>在確認視窗中可修改日期與時間；按下確認後，行事曆會使用畫面上最後選定的日期與時間。</w:t>
+      </w:r>
+    </w:p>
+    <w:p>
+      <w:pPr>
+        <w:pStyle w:val="a0"/>
+        <w:spacing w:after="80"/>
+      </w:pPr>
+      <w:r>
+        <w:t>從推薦活動或推薦景點建立的行程一律視為單日行程，不另存結束日期。若活動本身跨日，原始推薦資料仍會保留，只有新增到個人行事曆的副本採單日方式。</w:t>
+      </w:r>
+    </w:p>
+    <w:p>
+      <w:pPr>
+        <w:pStyle w:val="a0"/>
+        <w:spacing w:after="80"/>
+      </w:pPr>
+      <w:r>
+        <w:t>若相同內容已存在行事曆，系統會先提示，再由使用者決定是否重複加入。</w:t>
+      </w:r>
+    </w:p>
+    <w:p>
+      <w:pPr>
+        <w:pStyle w:val="a0"/>
+        <w:spacing w:after="80"/>
+      </w:pPr>
+      <w:r>
+        <w:t>加入成功後會同步更新行事曆快取；首頁只顯示今天起三天內的近期行程，較晚日期的行程請到行事曆查看。</w:t>
+      </w:r>
+    </w:p>
+    <w:p>
+      <w:pPr>
+        <w:pStyle w:val="21"/>
+      </w:pPr>
+      <w:r>
+        <w:t>完成行程並建立相關紀錄</w:t>
+      </w:r>
+    </w:p>
+    <w:p>
+      <w:pPr>
+        <w:pStyle w:val="a0"/>
+        <w:spacing w:after="80"/>
+      </w:pPr>
+      <w:r>
+        <w:t>完成行程時可自行勾選是否建立回憶、收支與積分；預設不勾選加入回憶。</w:t>
+      </w:r>
+    </w:p>
+    <w:p>
+      <w:pPr>
+        <w:pStyle w:val="a0"/>
+        <w:spacing w:after="80"/>
+      </w:pPr>
+      <w:r>
+        <w:t>同時建立收支與積分時，兩筆紀錄共用同一組日期與時間，方便日後對照同一趟行程。</w:t>
+      </w:r>
+    </w:p>
+    <w:p>
+      <w:pPr>
+        <w:pStyle w:val="a0"/>
+        <w:spacing w:after="80"/>
+      </w:pPr>
+      <w:r>
+        <w:t>建立收支時可選帳戶、收入或支出、金額與分類；建立積分時可選帳戶、加分或減分、分數與分類。</w:t>
+      </w:r>
+    </w:p>
+    <w:p>
+      <w:pPr>
+        <w:pStyle w:val="a0"/>
+        <w:spacing w:after="80"/>
+      </w:pPr>
+      <w:r>
+        <w:t>送出前的確認視窗會列出名稱、數值、分類、日期與時間。確認資料正確後再儲存。</w:t>
+      </w:r>
+    </w:p>
+    <w:p>
+      <w:pPr>
+        <w:pStyle w:val="21"/>
+      </w:pPr>
+      <w:r>
+        <w:t>日期時間與畫面更新檢查</w:t>
+      </w:r>
+      <w:r>
+        <w:br w:type="page"/>
+      </w:r>
+    </w:p>
+    <w:tbl>
+      <w:tblPr>
+        <w:tblStyle w:val="aff2"/>
+        <w:tblW w:type="auto" w:w="0"/>
+        <w:tblLayout w:type="autofit"/>
+        <w:tblLook w:firstColumn="1" w:firstRow="1" w:lastColumn="0" w:lastRow="0" w:noHBand="0" w:noVBand="1" w:val="04A0"/>
+      </w:tblPr>
+      <w:tblGrid>
+        <w:gridCol w:w="3324"/>
+        <w:gridCol w:w="3324"/>
+        <w:gridCol w:w="3324"/>
+      </w:tblGrid>
+      <w:tr>
+        <w:trPr>
+          <w:tblHeader w:val="true"/>
+        </w:trPr>
+        <w:tc>
+          <w:tcPr>
+            <w:tcW w:type="dxa" w:w="3324"/>
+            <w:vAlign w:val="center"/>
+            <w:tcMar>
+              <w:top w:w="90" w:type="dxa"/>
+              <w:left w:w="110" w:type="dxa"/>
+              <w:bottom w:w="90" w:type="dxa"/>
+              <w:right w:w="110" w:type="dxa"/>
+            </w:tcMar>
+            <w:shd w:fill="D9EAF7"/>
+          </w:tcPr>
+          <w:p>
+            <w:pPr>
+              <w:spacing w:after="40" w:line="259" w:lineRule="auto"/>
+            </w:pPr>
+            <w:r>
+              <w:rPr>
+                <w:b/>
+                <w:sz w:val="21"/>
+              </w:rPr>
+              <w:t>情境</w:t>
+            </w:r>
+          </w:p>
+        </w:tc>
+        <w:tc>
+          <w:tcPr>
+            <w:tcW w:type="dxa" w:w="3324"/>
+            <w:vAlign w:val="center"/>
+            <w:tcMar>
+              <w:top w:w="90" w:type="dxa"/>
+              <w:left w:w="110" w:type="dxa"/>
+              <w:bottom w:w="90" w:type="dxa"/>
+              <w:right w:w="110" w:type="dxa"/>
+            </w:tcMar>
+            <w:shd w:fill="D9EAF7"/>
+          </w:tcPr>
+          <w:p>
+            <w:pPr>
+              <w:spacing w:after="40" w:line="259" w:lineRule="auto"/>
+            </w:pPr>
+            <w:r>
+              <w:rPr>
+                <w:b/>
+                <w:sz w:val="21"/>
+              </w:rPr>
+              <w:t>應看到的結果</w:t>
+            </w:r>
+          </w:p>
+        </w:tc>
+        <w:tc>
+          <w:tcPr>
+            <w:tcW w:type="dxa" w:w="3324"/>
+            <w:vAlign w:val="center"/>
+            <w:tcMar>
+              <w:top w:w="90" w:type="dxa"/>
+              <w:left w:w="110" w:type="dxa"/>
+              <w:bottom w:w="90" w:type="dxa"/>
+              <w:right w:w="110" w:type="dxa"/>
+            </w:tcMar>
+            <w:shd w:fill="D9EAF7"/>
+          </w:tcPr>
+          <w:p>
+            <w:pPr>
+              <w:spacing w:after="40" w:line="259" w:lineRule="auto"/>
+            </w:pPr>
+            <w:r>
+              <w:rPr>
+                <w:b/>
+                <w:sz w:val="21"/>
+              </w:rPr>
+              <w:t>需要注意</w:t>
+            </w:r>
+          </w:p>
+        </w:tc>
+      </w:tr>
+      <w:tr>
+        <w:tc>
+          <w:tcPr>
+            <w:tcW w:type="dxa" w:w="3324"/>
+            <w:vAlign w:val="center"/>
+            <w:tcMar>
+              <w:top w:w="90" w:type="dxa"/>
+              <w:left w:w="110" w:type="dxa"/>
+              <w:bottom w:w="90" w:type="dxa"/>
+              <w:right w:w="110" w:type="dxa"/>
+            </w:tcMar>
+          </w:tcPr>
+          <w:p>
+            <w:pPr>
+              <w:spacing w:after="40" w:line="259" w:lineRule="auto"/>
+            </w:pPr>
+            <w:r>
+              <w:rPr>
+                <w:sz w:val="21"/>
+              </w:rPr>
+              <w:t>加入今天或未來三天的行程</w:t>
+            </w:r>
+          </w:p>
+        </w:tc>
+        <w:tc>
+          <w:tcPr>
+            <w:tcW w:type="dxa" w:w="3324"/>
+            <w:vAlign w:val="center"/>
+            <w:tcMar>
+              <w:top w:w="90" w:type="dxa"/>
+              <w:left w:w="110" w:type="dxa"/>
+              <w:bottom w:w="90" w:type="dxa"/>
+              <w:right w:w="110" w:type="dxa"/>
+            </w:tcMar>
+          </w:tcPr>
+          <w:p>
+            <w:pPr>
+              <w:spacing w:after="40" w:line="259" w:lineRule="auto"/>
+            </w:pPr>
+            <w:r>
+              <w:rPr>
+                <w:sz w:val="21"/>
+              </w:rPr>
+              <w:t>首頁近期行程立即出現</w:t>
+            </w:r>
+          </w:p>
+        </w:tc>
+        <w:tc>
+          <w:tcPr>
+            <w:tcW w:type="dxa" w:w="3324"/>
+            <w:vAlign w:val="center"/>
+            <w:tcMar>
+              <w:top w:w="90" w:type="dxa"/>
+              <w:left w:w="110" w:type="dxa"/>
+              <w:bottom w:w="90" w:type="dxa"/>
+              <w:right w:w="110" w:type="dxa"/>
+            </w:tcMar>
+          </w:tcPr>
+          <w:p>
+            <w:pPr>
+              <w:spacing w:after="40" w:line="259" w:lineRule="auto"/>
+            </w:pPr>
+            <w:r>
+              <w:rPr>
+                <w:sz w:val="21"/>
+              </w:rPr>
+              <w:t>若未出現，可切換頁面再回首頁確認。</w:t>
+            </w:r>
+          </w:p>
+        </w:tc>
+      </w:tr>
+      <w:tr>
+        <w:tc>
+          <w:tcPr>
+            <w:tcW w:type="dxa" w:w="3324"/>
+            <w:vAlign w:val="center"/>
+            <w:tcMar>
+              <w:top w:w="90" w:type="dxa"/>
+              <w:left w:w="110" w:type="dxa"/>
+              <w:bottom w:w="90" w:type="dxa"/>
+              <w:right w:w="110" w:type="dxa"/>
+            </w:tcMar>
+            <w:shd w:fill="F7FAFC"/>
+          </w:tcPr>
+          <w:p>
+            <w:pPr>
+              <w:spacing w:after="40" w:line="259" w:lineRule="auto"/>
+            </w:pPr>
+            <w:r>
+              <w:rPr>
+                <w:sz w:val="21"/>
+              </w:rPr>
+              <w:t>加入三天以後的行程</w:t>
+            </w:r>
+          </w:p>
+        </w:tc>
+        <w:tc>
+          <w:tcPr>
+            <w:tcW w:type="dxa" w:w="3324"/>
+            <w:vAlign w:val="center"/>
+            <w:tcMar>
+              <w:top w:w="90" w:type="dxa"/>
+              <w:left w:w="110" w:type="dxa"/>
+              <w:bottom w:w="90" w:type="dxa"/>
+              <w:right w:w="110" w:type="dxa"/>
+            </w:tcMar>
+            <w:shd w:fill="F7FAFC"/>
+          </w:tcPr>
+          <w:p>
+            <w:pPr>
+              <w:spacing w:after="40" w:line="259" w:lineRule="auto"/>
+            </w:pPr>
+            <w:r>
+              <w:rPr>
+                <w:sz w:val="21"/>
+              </w:rPr>
+              <w:t>行事曆中可找到，首頁近期區塊不顯示</w:t>
+            </w:r>
+          </w:p>
+        </w:tc>
+        <w:tc>
+          <w:tcPr>
+            <w:tcW w:type="dxa" w:w="3324"/>
+            <w:vAlign w:val="center"/>
+            <w:tcMar>
+              <w:top w:w="90" w:type="dxa"/>
+              <w:left w:w="110" w:type="dxa"/>
+              <w:bottom w:w="90" w:type="dxa"/>
+              <w:right w:w="110" w:type="dxa"/>
+            </w:tcMar>
+            <w:shd w:fill="F7FAFC"/>
+          </w:tcPr>
+          <w:p>
+            <w:pPr>
+              <w:spacing w:after="40" w:line="259" w:lineRule="auto"/>
+            </w:pPr>
+            <w:r>
+              <w:rPr>
+                <w:sz w:val="21"/>
+              </w:rPr>
+              <w:t>這是首頁顯示範圍，不代表新增失敗。</w:t>
+            </w:r>
+          </w:p>
+        </w:tc>
+      </w:tr>
+      <w:tr>
+        <w:tc>
+          <w:tcPr>
+            <w:tcW w:type="dxa" w:w="3324"/>
+            <w:vAlign w:val="center"/>
+            <w:tcMar>
+              <w:top w:w="90" w:type="dxa"/>
+              <w:left w:w="110" w:type="dxa"/>
+              <w:bottom w:w="90" w:type="dxa"/>
+              <w:right w:w="110" w:type="dxa"/>
+            </w:tcMar>
+          </w:tcPr>
+          <w:p>
+            <w:pPr>
+              <w:spacing w:after="40" w:line="259" w:lineRule="auto"/>
+            </w:pPr>
+            <w:r>
+              <w:rPr>
+                <w:sz w:val="21"/>
+              </w:rPr>
+              <w:t>選定日期與時間後建立收支或積分</w:t>
+            </w:r>
+          </w:p>
+        </w:tc>
+        <w:tc>
+          <w:tcPr>
+            <w:tcW w:type="dxa" w:w="3324"/>
+            <w:vAlign w:val="center"/>
+            <w:tcMar>
+              <w:top w:w="90" w:type="dxa"/>
+              <w:left w:w="110" w:type="dxa"/>
+              <w:bottom w:w="90" w:type="dxa"/>
+              <w:right w:w="110" w:type="dxa"/>
+            </w:tcMar>
+          </w:tcPr>
+          <w:p>
+            <w:pPr>
+              <w:spacing w:after="40" w:line="259" w:lineRule="auto"/>
+            </w:pPr>
+            <w:r>
+              <w:rPr>
+                <w:sz w:val="21"/>
+              </w:rPr>
+              <w:t>明細以選定的時間儲存並排序</w:t>
+            </w:r>
+          </w:p>
+        </w:tc>
+        <w:tc>
+          <w:tcPr>
+            <w:tcW w:type="dxa" w:w="3324"/>
+            <w:vAlign w:val="center"/>
+            <w:tcMar>
+              <w:top w:w="90" w:type="dxa"/>
+              <w:left w:w="110" w:type="dxa"/>
+              <w:bottom w:w="90" w:type="dxa"/>
+              <w:right w:w="110" w:type="dxa"/>
+            </w:tcMar>
+          </w:tcPr>
+          <w:p>
+            <w:pPr>
+              <w:spacing w:after="40" w:line="259" w:lineRule="auto"/>
+            </w:pPr>
+            <w:r>
+              <w:rPr>
+                <w:sz w:val="21"/>
+              </w:rPr>
+              <w:t>確認視窗中的日期時間應與明細一致。</w:t>
+            </w:r>
+          </w:p>
+        </w:tc>
+      </w:tr>
+      <w:tr>
+        <w:tc>
+          <w:tcPr>
+            <w:tcW w:type="dxa" w:w="3324"/>
+            <w:vAlign w:val="center"/>
+            <w:tcMar>
+              <w:top w:w="90" w:type="dxa"/>
+              <w:left w:w="110" w:type="dxa"/>
+              <w:bottom w:w="90" w:type="dxa"/>
+              <w:right w:w="110" w:type="dxa"/>
+            </w:tcMar>
+            <w:shd w:fill="F7FAFC"/>
+          </w:tcPr>
+          <w:p>
+            <w:pPr>
+              <w:spacing w:after="40" w:line="259" w:lineRule="auto"/>
+            </w:pPr>
+            <w:r>
+              <w:rPr>
+                <w:sz w:val="21"/>
+              </w:rPr>
+              <w:t>取消確認視窗</w:t>
+            </w:r>
+          </w:p>
+        </w:tc>
+        <w:tc>
+          <w:tcPr>
+            <w:tcW w:type="dxa" w:w="3324"/>
+            <w:vAlign w:val="center"/>
+            <w:tcMar>
+              <w:top w:w="90" w:type="dxa"/>
+              <w:left w:w="110" w:type="dxa"/>
+              <w:bottom w:w="90" w:type="dxa"/>
+              <w:right w:w="110" w:type="dxa"/>
+            </w:tcMar>
+            <w:shd w:fill="F7FAFC"/>
+          </w:tcPr>
+          <w:p>
+            <w:pPr>
+              <w:spacing w:after="40" w:line="259" w:lineRule="auto"/>
+            </w:pPr>
+            <w:r>
+              <w:rPr>
+                <w:sz w:val="21"/>
+              </w:rPr>
+              <w:t>不建立行程或明細</w:t>
+            </w:r>
+          </w:p>
+        </w:tc>
+        <w:tc>
+          <w:tcPr>
+            <w:tcW w:type="dxa" w:w="3324"/>
+            <w:vAlign w:val="center"/>
+            <w:tcMar>
+              <w:top w:w="90" w:type="dxa"/>
+              <w:left w:w="110" w:type="dxa"/>
+              <w:bottom w:w="90" w:type="dxa"/>
+              <w:right w:w="110" w:type="dxa"/>
+            </w:tcMar>
+            <w:shd w:fill="F7FAFC"/>
+          </w:tcPr>
+          <w:p>
+            <w:pPr>
+              <w:spacing w:after="40" w:line="259" w:lineRule="auto"/>
+            </w:pPr>
+            <w:r>
+              <w:rPr>
+                <w:sz w:val="21"/>
+              </w:rPr>
+              <w:t>取消後原始推薦內容與行程狀態不變。</w:t>
+            </w:r>
+          </w:p>
+        </w:tc>
+      </w:tr>
+    </w:tbl>
+    <w:p>
+      <w:pPr>
+        <w:pStyle w:val="1"/>
+      </w:pPr>
+      <w:r>
+        <w:t>2026 年 9 月首頁資訊收合更新</w:t>
+      </w:r>
+    </w:p>
+    <w:p>
+      <w:r>
+        <w:t>首頁將常用摘要整理成可收合區塊，先呈現近期行程與清楚的功能入口，讓手機首屏更容易閱讀。</w:t>
+      </w:r>
+    </w:p>
+    <w:p>
+      <w:pPr>
+        <w:pStyle w:val="21"/>
+      </w:pPr>
+      <w:r>
+        <w:t>展開首頁摘要</w:t>
+      </w:r>
+    </w:p>
+    <w:p>
+      <w:pPr>
+        <w:pStyle w:val="a0"/>
+        <w:spacing w:after="80"/>
+      </w:pPr>
+      <w:r>
+        <w:t>推薦活動、推薦景點、記帳與積分預設收合，只顯示標題與向下箭頭。</w:t>
+      </w:r>
+    </w:p>
+    <w:p>
+      <w:pPr>
+        <w:pStyle w:val="a0"/>
+        <w:spacing w:after="80"/>
+      </w:pPr>
+      <w:r>
+        <w:t>按下箭頭後才顯示城市、帳戶、新增按鈕、摘要與明細；再次按下箭頭可收合。</w:t>
+      </w:r>
+    </w:p>
+    <w:p>
+      <w:pPr>
+        <w:pStyle w:val="a0"/>
+        <w:spacing w:after="80"/>
+      </w:pPr>
+      <w:r>
+        <w:t>完成行程與建立回憶、收支或積分是獨立流程，即使四個摘要都收合，仍可正常使用。</w:t>
+      </w:r>
+    </w:p>
+    <w:p>
+      <w:pPr>
+        <w:pStyle w:val="a0"/>
+        <w:spacing w:after="80"/>
+      </w:pPr>
+      <w:r>
+        <w:t>下拉重新整理仍會更新首頁資料；展開區塊時會看到最新已載入的內容。</w:t>
+      </w:r>
     </w:p>
     <w:sectPr>
       <w:footerReference w:type="default" r:id="rId8"/>

</xml_diff>

<commit_message>
fix(docs): repair Word document compatibility
</commit_message>
<xml_diff>
--- a/docs/Life_Pilot_使用者操作說明.docx
+++ b/docs/Life_Pilot_使用者操作說明.docx
@@ -55,20 +55,18 @@
         <w:tc>
           <w:tcPr>
             <w:tcW w:type="dxa" w:w="5083"/>
-            <w:shd w:fill="EAF1F8"/>
             <w:tcBorders>
               <w:top w:val="single" w:sz="6" w:color="D9D9D9"/>
               <w:left w:val="single" w:sz="6" w:color="D9D9D9"/>
               <w:bottom w:val="single" w:sz="6" w:color="D9D9D9"/>
               <w:right w:val="single" w:sz="6" w:color="D9D9D9"/>
-              <w:insideH w:val="single" w:sz="6" w:color="D9D9D9"/>
-              <w:insideV w:val="single" w:sz="6" w:color="D9D9D9"/>
             </w:tcBorders>
+            <w:shd w:fill="EAF1F8"/>
             <w:tcMar>
               <w:top w:w="120" w:type="dxa"/>
-              <w:start w:w="130" w:type="dxa"/>
+              <w:left w:w="130" w:type="dxa"/>
               <w:bottom w:w="120" w:type="dxa"/>
-              <w:end w:w="130" w:type="dxa"/>
+              <w:right w:w="130" w:type="dxa"/>
             </w:tcMar>
             <w:vAlign w:val="center"/>
           </w:tcPr>
@@ -89,14 +87,12 @@
               <w:left w:val="single" w:sz="6" w:color="D9D9D9"/>
               <w:bottom w:val="single" w:sz="6" w:color="D9D9D9"/>
               <w:right w:val="single" w:sz="6" w:color="D9D9D9"/>
-              <w:insideH w:val="single" w:sz="6" w:color="D9D9D9"/>
-              <w:insideV w:val="single" w:sz="6" w:color="D9D9D9"/>
             </w:tcBorders>
             <w:tcMar>
               <w:top w:w="120" w:type="dxa"/>
-              <w:start w:w="130" w:type="dxa"/>
+              <w:left w:w="130" w:type="dxa"/>
               <w:bottom w:w="120" w:type="dxa"/>
-              <w:end w:w="130" w:type="dxa"/>
+              <w:right w:w="130" w:type="dxa"/>
             </w:tcMar>
             <w:vAlign w:val="center"/>
           </w:tcPr>
@@ -111,20 +107,18 @@
         <w:tc>
           <w:tcPr>
             <w:tcW w:type="dxa" w:w="5083"/>
-            <w:shd w:fill="EAF1F8"/>
             <w:tcBorders>
               <w:top w:val="single" w:sz="6" w:color="D9D9D9"/>
               <w:left w:val="single" w:sz="6" w:color="D9D9D9"/>
               <w:bottom w:val="single" w:sz="6" w:color="D9D9D9"/>
               <w:right w:val="single" w:sz="6" w:color="D9D9D9"/>
-              <w:insideH w:val="single" w:sz="6" w:color="D9D9D9"/>
-              <w:insideV w:val="single" w:sz="6" w:color="D9D9D9"/>
             </w:tcBorders>
+            <w:shd w:fill="EAF1F8"/>
             <w:tcMar>
               <w:top w:w="120" w:type="dxa"/>
-              <w:start w:w="130" w:type="dxa"/>
+              <w:left w:w="130" w:type="dxa"/>
               <w:bottom w:w="120" w:type="dxa"/>
-              <w:end w:w="130" w:type="dxa"/>
+              <w:right w:w="130" w:type="dxa"/>
             </w:tcMar>
             <w:vAlign w:val="center"/>
           </w:tcPr>
@@ -145,14 +139,12 @@
               <w:left w:val="single" w:sz="6" w:color="D9D9D9"/>
               <w:bottom w:val="single" w:sz="6" w:color="D9D9D9"/>
               <w:right w:val="single" w:sz="6" w:color="D9D9D9"/>
-              <w:insideH w:val="single" w:sz="6" w:color="D9D9D9"/>
-              <w:insideV w:val="single" w:sz="6" w:color="D9D9D9"/>
             </w:tcBorders>
             <w:tcMar>
               <w:top w:w="120" w:type="dxa"/>
-              <w:start w:w="130" w:type="dxa"/>
+              <w:left w:w="130" w:type="dxa"/>
               <w:bottom w:w="120" w:type="dxa"/>
-              <w:end w:w="130" w:type="dxa"/>
+              <w:right w:w="130" w:type="dxa"/>
             </w:tcMar>
             <w:vAlign w:val="center"/>
           </w:tcPr>
@@ -167,20 +159,18 @@
         <w:tc>
           <w:tcPr>
             <w:tcW w:type="dxa" w:w="5083"/>
-            <w:shd w:fill="EAF1F8"/>
             <w:tcBorders>
               <w:top w:val="single" w:sz="6" w:color="D9D9D9"/>
               <w:left w:val="single" w:sz="6" w:color="D9D9D9"/>
               <w:bottom w:val="single" w:sz="6" w:color="D9D9D9"/>
               <w:right w:val="single" w:sz="6" w:color="D9D9D9"/>
-              <w:insideH w:val="single" w:sz="6" w:color="D9D9D9"/>
-              <w:insideV w:val="single" w:sz="6" w:color="D9D9D9"/>
             </w:tcBorders>
+            <w:shd w:fill="EAF1F8"/>
             <w:tcMar>
               <w:top w:w="120" w:type="dxa"/>
-              <w:start w:w="130" w:type="dxa"/>
+              <w:left w:w="130" w:type="dxa"/>
               <w:bottom w:w="120" w:type="dxa"/>
-              <w:end w:w="130" w:type="dxa"/>
+              <w:right w:w="130" w:type="dxa"/>
             </w:tcMar>
             <w:vAlign w:val="center"/>
           </w:tcPr>
@@ -201,14 +191,12 @@
               <w:left w:val="single" w:sz="6" w:color="D9D9D9"/>
               <w:bottom w:val="single" w:sz="6" w:color="D9D9D9"/>
               <w:right w:val="single" w:sz="6" w:color="D9D9D9"/>
-              <w:insideH w:val="single" w:sz="6" w:color="D9D9D9"/>
-              <w:insideV w:val="single" w:sz="6" w:color="D9D9D9"/>
             </w:tcBorders>
             <w:tcMar>
               <w:top w:w="120" w:type="dxa"/>
-              <w:start w:w="130" w:type="dxa"/>
+              <w:left w:w="130" w:type="dxa"/>
               <w:bottom w:w="120" w:type="dxa"/>
-              <w:end w:w="130" w:type="dxa"/>
+              <w:right w:w="130" w:type="dxa"/>
             </w:tcMar>
             <w:vAlign w:val="center"/>
           </w:tcPr>
@@ -278,22 +266,20 @@
         <w:tc>
           <w:tcPr>
             <w:tcW w:type="dxa" w:w="5083"/>
-            <w:vAlign w:val="center"/>
             <w:tcBorders>
               <w:top w:val="single" w:sz="6" w:color="D9D9D9"/>
               <w:left w:val="single" w:sz="6" w:color="D9D9D9"/>
               <w:bottom w:val="single" w:sz="6" w:color="D9D9D9"/>
               <w:right w:val="single" w:sz="6" w:color="D9D9D9"/>
-              <w:insideH w:val="single" w:sz="6" w:color="D9D9D9"/>
-              <w:insideV w:val="single" w:sz="6" w:color="D9D9D9"/>
             </w:tcBorders>
+            <w:shd w:fill="17365D"/>
             <w:tcMar>
               <w:top w:w="90" w:type="dxa"/>
-              <w:start w:w="100" w:type="dxa"/>
+              <w:left w:w="100" w:type="dxa"/>
               <w:bottom w:w="90" w:type="dxa"/>
-              <w:end w:w="100" w:type="dxa"/>
+              <w:right w:w="100" w:type="dxa"/>
             </w:tcMar>
-            <w:shd w:fill="17365D"/>
+            <w:vAlign w:val="center"/>
           </w:tcPr>
           <w:p>
             <w:pPr>
@@ -313,22 +299,20 @@
         <w:tc>
           <w:tcPr>
             <w:tcW w:type="dxa" w:w="5083"/>
-            <w:vAlign w:val="center"/>
             <w:tcBorders>
               <w:top w:val="single" w:sz="6" w:color="D9D9D9"/>
               <w:left w:val="single" w:sz="6" w:color="D9D9D9"/>
               <w:bottom w:val="single" w:sz="6" w:color="D9D9D9"/>
               <w:right w:val="single" w:sz="6" w:color="D9D9D9"/>
-              <w:insideH w:val="single" w:sz="6" w:color="D9D9D9"/>
-              <w:insideV w:val="single" w:sz="6" w:color="D9D9D9"/>
             </w:tcBorders>
+            <w:shd w:fill="17365D"/>
             <w:tcMar>
               <w:top w:w="90" w:type="dxa"/>
-              <w:start w:w="100" w:type="dxa"/>
+              <w:left w:w="100" w:type="dxa"/>
               <w:bottom w:w="90" w:type="dxa"/>
-              <w:end w:w="100" w:type="dxa"/>
+              <w:right w:w="100" w:type="dxa"/>
             </w:tcMar>
-            <w:shd w:fill="17365D"/>
+            <w:vAlign w:val="center"/>
           </w:tcPr>
           <w:p>
             <w:pPr>
@@ -350,21 +334,19 @@
         <w:tc>
           <w:tcPr>
             <w:tcW w:type="dxa" w:w="5083"/>
-            <w:vAlign w:val="center"/>
             <w:tcBorders>
               <w:top w:val="single" w:sz="6" w:color="D9D9D9"/>
               <w:left w:val="single" w:sz="6" w:color="D9D9D9"/>
               <w:bottom w:val="single" w:sz="6" w:color="D9D9D9"/>
               <w:right w:val="single" w:sz="6" w:color="D9D9D9"/>
-              <w:insideH w:val="single" w:sz="6" w:color="D9D9D9"/>
-              <w:insideV w:val="single" w:sz="6" w:color="D9D9D9"/>
             </w:tcBorders>
             <w:tcMar>
               <w:top w:w="90" w:type="dxa"/>
-              <w:start w:w="100" w:type="dxa"/>
+              <w:left w:w="100" w:type="dxa"/>
               <w:bottom w:w="90" w:type="dxa"/>
-              <w:end w:w="100" w:type="dxa"/>
+              <w:right w:w="100" w:type="dxa"/>
             </w:tcMar>
+            <w:vAlign w:val="center"/>
           </w:tcPr>
           <w:p>
             <w:pPr>
@@ -382,21 +364,19 @@
         <w:tc>
           <w:tcPr>
             <w:tcW w:type="dxa" w:w="5083"/>
-            <w:vAlign w:val="center"/>
             <w:tcBorders>
               <w:top w:val="single" w:sz="6" w:color="D9D9D9"/>
               <w:left w:val="single" w:sz="6" w:color="D9D9D9"/>
               <w:bottom w:val="single" w:sz="6" w:color="D9D9D9"/>
               <w:right w:val="single" w:sz="6" w:color="D9D9D9"/>
-              <w:insideH w:val="single" w:sz="6" w:color="D9D9D9"/>
-              <w:insideV w:val="single" w:sz="6" w:color="D9D9D9"/>
             </w:tcBorders>
             <w:tcMar>
               <w:top w:w="90" w:type="dxa"/>
-              <w:start w:w="100" w:type="dxa"/>
+              <w:left w:w="100" w:type="dxa"/>
               <w:bottom w:w="90" w:type="dxa"/>
-              <w:end w:w="100" w:type="dxa"/>
+              <w:right w:w="100" w:type="dxa"/>
             </w:tcMar>
+            <w:vAlign w:val="center"/>
           </w:tcPr>
           <w:p>
             <w:pPr>
@@ -416,22 +396,20 @@
         <w:tc>
           <w:tcPr>
             <w:tcW w:type="dxa" w:w="5083"/>
-            <w:vAlign w:val="center"/>
             <w:tcBorders>
               <w:top w:val="single" w:sz="6" w:color="D9D9D9"/>
               <w:left w:val="single" w:sz="6" w:color="D9D9D9"/>
               <w:bottom w:val="single" w:sz="6" w:color="D9D9D9"/>
               <w:right w:val="single" w:sz="6" w:color="D9D9D9"/>
-              <w:insideH w:val="single" w:sz="6" w:color="D9D9D9"/>
-              <w:insideV w:val="single" w:sz="6" w:color="D9D9D9"/>
             </w:tcBorders>
+            <w:shd w:fill="F8FAFC"/>
             <w:tcMar>
               <w:top w:w="90" w:type="dxa"/>
-              <w:start w:w="100" w:type="dxa"/>
+              <w:left w:w="100" w:type="dxa"/>
               <w:bottom w:w="90" w:type="dxa"/>
-              <w:end w:w="100" w:type="dxa"/>
+              <w:right w:w="100" w:type="dxa"/>
             </w:tcMar>
-            <w:shd w:fill="F8FAFC"/>
+            <w:vAlign w:val="center"/>
           </w:tcPr>
           <w:p>
             <w:pPr>
@@ -449,22 +427,20 @@
         <w:tc>
           <w:tcPr>
             <w:tcW w:type="dxa" w:w="5083"/>
-            <w:vAlign w:val="center"/>
             <w:tcBorders>
               <w:top w:val="single" w:sz="6" w:color="D9D9D9"/>
               <w:left w:val="single" w:sz="6" w:color="D9D9D9"/>
               <w:bottom w:val="single" w:sz="6" w:color="D9D9D9"/>
               <w:right w:val="single" w:sz="6" w:color="D9D9D9"/>
-              <w:insideH w:val="single" w:sz="6" w:color="D9D9D9"/>
-              <w:insideV w:val="single" w:sz="6" w:color="D9D9D9"/>
             </w:tcBorders>
+            <w:shd w:fill="F8FAFC"/>
             <w:tcMar>
               <w:top w:w="90" w:type="dxa"/>
-              <w:start w:w="100" w:type="dxa"/>
+              <w:left w:w="100" w:type="dxa"/>
               <w:bottom w:w="90" w:type="dxa"/>
-              <w:end w:w="100" w:type="dxa"/>
+              <w:right w:w="100" w:type="dxa"/>
             </w:tcMar>
-            <w:shd w:fill="F8FAFC"/>
+            <w:vAlign w:val="center"/>
           </w:tcPr>
           <w:p>
             <w:pPr>
@@ -484,21 +460,19 @@
         <w:tc>
           <w:tcPr>
             <w:tcW w:type="dxa" w:w="5083"/>
-            <w:vAlign w:val="center"/>
             <w:tcBorders>
               <w:top w:val="single" w:sz="6" w:color="D9D9D9"/>
               <w:left w:val="single" w:sz="6" w:color="D9D9D9"/>
               <w:bottom w:val="single" w:sz="6" w:color="D9D9D9"/>
               <w:right w:val="single" w:sz="6" w:color="D9D9D9"/>
-              <w:insideH w:val="single" w:sz="6" w:color="D9D9D9"/>
-              <w:insideV w:val="single" w:sz="6" w:color="D9D9D9"/>
             </w:tcBorders>
             <w:tcMar>
               <w:top w:w="90" w:type="dxa"/>
-              <w:start w:w="100" w:type="dxa"/>
+              <w:left w:w="100" w:type="dxa"/>
               <w:bottom w:w="90" w:type="dxa"/>
-              <w:end w:w="100" w:type="dxa"/>
+              <w:right w:w="100" w:type="dxa"/>
             </w:tcMar>
+            <w:vAlign w:val="center"/>
           </w:tcPr>
           <w:p>
             <w:pPr>
@@ -516,21 +490,19 @@
         <w:tc>
           <w:tcPr>
             <w:tcW w:type="dxa" w:w="5083"/>
-            <w:vAlign w:val="center"/>
             <w:tcBorders>
               <w:top w:val="single" w:sz="6" w:color="D9D9D9"/>
               <w:left w:val="single" w:sz="6" w:color="D9D9D9"/>
               <w:bottom w:val="single" w:sz="6" w:color="D9D9D9"/>
               <w:right w:val="single" w:sz="6" w:color="D9D9D9"/>
-              <w:insideH w:val="single" w:sz="6" w:color="D9D9D9"/>
-              <w:insideV w:val="single" w:sz="6" w:color="D9D9D9"/>
             </w:tcBorders>
             <w:tcMar>
               <w:top w:w="90" w:type="dxa"/>
-              <w:start w:w="100" w:type="dxa"/>
+              <w:left w:w="100" w:type="dxa"/>
               <w:bottom w:w="90" w:type="dxa"/>
-              <w:end w:w="100" w:type="dxa"/>
+              <w:right w:w="100" w:type="dxa"/>
             </w:tcMar>
+            <w:vAlign w:val="center"/>
           </w:tcPr>
           <w:p>
             <w:pPr>
@@ -550,22 +522,20 @@
         <w:tc>
           <w:tcPr>
             <w:tcW w:type="dxa" w:w="5083"/>
-            <w:vAlign w:val="center"/>
             <w:tcBorders>
               <w:top w:val="single" w:sz="6" w:color="D9D9D9"/>
               <w:left w:val="single" w:sz="6" w:color="D9D9D9"/>
               <w:bottom w:val="single" w:sz="6" w:color="D9D9D9"/>
               <w:right w:val="single" w:sz="6" w:color="D9D9D9"/>
-              <w:insideH w:val="single" w:sz="6" w:color="D9D9D9"/>
-              <w:insideV w:val="single" w:sz="6" w:color="D9D9D9"/>
             </w:tcBorders>
+            <w:shd w:fill="F8FAFC"/>
             <w:tcMar>
               <w:top w:w="90" w:type="dxa"/>
-              <w:start w:w="100" w:type="dxa"/>
+              <w:left w:w="100" w:type="dxa"/>
               <w:bottom w:w="90" w:type="dxa"/>
-              <w:end w:w="100" w:type="dxa"/>
+              <w:right w:w="100" w:type="dxa"/>
             </w:tcMar>
-            <w:shd w:fill="F8FAFC"/>
+            <w:vAlign w:val="center"/>
           </w:tcPr>
           <w:p>
             <w:pPr>
@@ -583,22 +553,20 @@
         <w:tc>
           <w:tcPr>
             <w:tcW w:type="dxa" w:w="5083"/>
-            <w:vAlign w:val="center"/>
             <w:tcBorders>
               <w:top w:val="single" w:sz="6" w:color="D9D9D9"/>
               <w:left w:val="single" w:sz="6" w:color="D9D9D9"/>
               <w:bottom w:val="single" w:sz="6" w:color="D9D9D9"/>
               <w:right w:val="single" w:sz="6" w:color="D9D9D9"/>
-              <w:insideH w:val="single" w:sz="6" w:color="D9D9D9"/>
-              <w:insideV w:val="single" w:sz="6" w:color="D9D9D9"/>
             </w:tcBorders>
+            <w:shd w:fill="F8FAFC"/>
             <w:tcMar>
               <w:top w:w="90" w:type="dxa"/>
-              <w:start w:w="100" w:type="dxa"/>
+              <w:left w:w="100" w:type="dxa"/>
               <w:bottom w:w="90" w:type="dxa"/>
-              <w:end w:w="100" w:type="dxa"/>
+              <w:right w:w="100" w:type="dxa"/>
             </w:tcMar>
-            <w:shd w:fill="F8FAFC"/>
+            <w:vAlign w:val="center"/>
           </w:tcPr>
           <w:p>
             <w:pPr>
@@ -618,21 +586,19 @@
         <w:tc>
           <w:tcPr>
             <w:tcW w:type="dxa" w:w="5083"/>
-            <w:vAlign w:val="center"/>
             <w:tcBorders>
               <w:top w:val="single" w:sz="6" w:color="D9D9D9"/>
               <w:left w:val="single" w:sz="6" w:color="D9D9D9"/>
               <w:bottom w:val="single" w:sz="6" w:color="D9D9D9"/>
               <w:right w:val="single" w:sz="6" w:color="D9D9D9"/>
-              <w:insideH w:val="single" w:sz="6" w:color="D9D9D9"/>
-              <w:insideV w:val="single" w:sz="6" w:color="D9D9D9"/>
             </w:tcBorders>
             <w:tcMar>
               <w:top w:w="90" w:type="dxa"/>
-              <w:start w:w="100" w:type="dxa"/>
+              <w:left w:w="100" w:type="dxa"/>
               <w:bottom w:w="90" w:type="dxa"/>
-              <w:end w:w="100" w:type="dxa"/>
+              <w:right w:w="100" w:type="dxa"/>
             </w:tcMar>
+            <w:vAlign w:val="center"/>
           </w:tcPr>
           <w:p>
             <w:pPr>
@@ -650,21 +616,19 @@
         <w:tc>
           <w:tcPr>
             <w:tcW w:type="dxa" w:w="5083"/>
-            <w:vAlign w:val="center"/>
             <w:tcBorders>
               <w:top w:val="single" w:sz="6" w:color="D9D9D9"/>
               <w:left w:val="single" w:sz="6" w:color="D9D9D9"/>
               <w:bottom w:val="single" w:sz="6" w:color="D9D9D9"/>
               <w:right w:val="single" w:sz="6" w:color="D9D9D9"/>
-              <w:insideH w:val="single" w:sz="6" w:color="D9D9D9"/>
-              <w:insideV w:val="single" w:sz="6" w:color="D9D9D9"/>
             </w:tcBorders>
             <w:tcMar>
               <w:top w:w="90" w:type="dxa"/>
-              <w:start w:w="100" w:type="dxa"/>
+              <w:left w:w="100" w:type="dxa"/>
               <w:bottom w:w="90" w:type="dxa"/>
-              <w:end w:w="100" w:type="dxa"/>
+              <w:right w:w="100" w:type="dxa"/>
             </w:tcMar>
+            <w:vAlign w:val="center"/>
           </w:tcPr>
           <w:p>
             <w:pPr>
@@ -684,22 +648,20 @@
         <w:tc>
           <w:tcPr>
             <w:tcW w:type="dxa" w:w="5083"/>
-            <w:vAlign w:val="center"/>
             <w:tcBorders>
               <w:top w:val="single" w:sz="6" w:color="D9D9D9"/>
               <w:left w:val="single" w:sz="6" w:color="D9D9D9"/>
               <w:bottom w:val="single" w:sz="6" w:color="D9D9D9"/>
               <w:right w:val="single" w:sz="6" w:color="D9D9D9"/>
-              <w:insideH w:val="single" w:sz="6" w:color="D9D9D9"/>
-              <w:insideV w:val="single" w:sz="6" w:color="D9D9D9"/>
             </w:tcBorders>
+            <w:shd w:fill="F8FAFC"/>
             <w:tcMar>
               <w:top w:w="90" w:type="dxa"/>
-              <w:start w:w="100" w:type="dxa"/>
+              <w:left w:w="100" w:type="dxa"/>
               <w:bottom w:w="90" w:type="dxa"/>
-              <w:end w:w="100" w:type="dxa"/>
+              <w:right w:w="100" w:type="dxa"/>
             </w:tcMar>
-            <w:shd w:fill="F8FAFC"/>
+            <w:vAlign w:val="center"/>
           </w:tcPr>
           <w:p>
             <w:pPr>
@@ -717,22 +679,20 @@
         <w:tc>
           <w:tcPr>
             <w:tcW w:type="dxa" w:w="5083"/>
-            <w:vAlign w:val="center"/>
             <w:tcBorders>
               <w:top w:val="single" w:sz="6" w:color="D9D9D9"/>
               <w:left w:val="single" w:sz="6" w:color="D9D9D9"/>
               <w:bottom w:val="single" w:sz="6" w:color="D9D9D9"/>
               <w:right w:val="single" w:sz="6" w:color="D9D9D9"/>
-              <w:insideH w:val="single" w:sz="6" w:color="D9D9D9"/>
-              <w:insideV w:val="single" w:sz="6" w:color="D9D9D9"/>
             </w:tcBorders>
+            <w:shd w:fill="F8FAFC"/>
             <w:tcMar>
               <w:top w:w="90" w:type="dxa"/>
-              <w:start w:w="100" w:type="dxa"/>
+              <w:left w:w="100" w:type="dxa"/>
               <w:bottom w:w="90" w:type="dxa"/>
-              <w:end w:w="100" w:type="dxa"/>
+              <w:right w:w="100" w:type="dxa"/>
             </w:tcMar>
-            <w:shd w:fill="F8FAFC"/>
+            <w:vAlign w:val="center"/>
           </w:tcPr>
           <w:p>
             <w:pPr>
@@ -752,21 +712,19 @@
         <w:tc>
           <w:tcPr>
             <w:tcW w:type="dxa" w:w="5083"/>
-            <w:vAlign w:val="center"/>
             <w:tcBorders>
               <w:top w:val="single" w:sz="6" w:color="D9D9D9"/>
               <w:left w:val="single" w:sz="6" w:color="D9D9D9"/>
               <w:bottom w:val="single" w:sz="6" w:color="D9D9D9"/>
               <w:right w:val="single" w:sz="6" w:color="D9D9D9"/>
-              <w:insideH w:val="single" w:sz="6" w:color="D9D9D9"/>
-              <w:insideV w:val="single" w:sz="6" w:color="D9D9D9"/>
             </w:tcBorders>
             <w:tcMar>
               <w:top w:w="90" w:type="dxa"/>
-              <w:start w:w="100" w:type="dxa"/>
+              <w:left w:w="100" w:type="dxa"/>
               <w:bottom w:w="90" w:type="dxa"/>
-              <w:end w:w="100" w:type="dxa"/>
+              <w:right w:w="100" w:type="dxa"/>
             </w:tcMar>
+            <w:vAlign w:val="center"/>
           </w:tcPr>
           <w:p>
             <w:pPr>
@@ -784,21 +742,19 @@
         <w:tc>
           <w:tcPr>
             <w:tcW w:type="dxa" w:w="5083"/>
-            <w:vAlign w:val="center"/>
             <w:tcBorders>
               <w:top w:val="single" w:sz="6" w:color="D9D9D9"/>
               <w:left w:val="single" w:sz="6" w:color="D9D9D9"/>
               <w:bottom w:val="single" w:sz="6" w:color="D9D9D9"/>
               <w:right w:val="single" w:sz="6" w:color="D9D9D9"/>
-              <w:insideH w:val="single" w:sz="6" w:color="D9D9D9"/>
-              <w:insideV w:val="single" w:sz="6" w:color="D9D9D9"/>
             </w:tcBorders>
             <w:tcMar>
               <w:top w:w="90" w:type="dxa"/>
-              <w:start w:w="100" w:type="dxa"/>
+              <w:left w:w="100" w:type="dxa"/>
               <w:bottom w:w="90" w:type="dxa"/>
-              <w:end w:w="100" w:type="dxa"/>
+              <w:right w:w="100" w:type="dxa"/>
             </w:tcMar>
+            <w:vAlign w:val="center"/>
           </w:tcPr>
           <w:p>
             <w:pPr>
@@ -818,22 +774,20 @@
         <w:tc>
           <w:tcPr>
             <w:tcW w:type="dxa" w:w="5083"/>
-            <w:vAlign w:val="center"/>
             <w:tcBorders>
               <w:top w:val="single" w:sz="6" w:color="D9D9D9"/>
               <w:left w:val="single" w:sz="6" w:color="D9D9D9"/>
               <w:bottom w:val="single" w:sz="6" w:color="D9D9D9"/>
               <w:right w:val="single" w:sz="6" w:color="D9D9D9"/>
-              <w:insideH w:val="single" w:sz="6" w:color="D9D9D9"/>
-              <w:insideV w:val="single" w:sz="6" w:color="D9D9D9"/>
             </w:tcBorders>
+            <w:shd w:fill="F8FAFC"/>
             <w:tcMar>
               <w:top w:w="90" w:type="dxa"/>
-              <w:start w:w="100" w:type="dxa"/>
+              <w:left w:w="100" w:type="dxa"/>
               <w:bottom w:w="90" w:type="dxa"/>
-              <w:end w:w="100" w:type="dxa"/>
+              <w:right w:w="100" w:type="dxa"/>
             </w:tcMar>
-            <w:shd w:fill="F8FAFC"/>
+            <w:vAlign w:val="center"/>
           </w:tcPr>
           <w:p>
             <w:pPr>
@@ -851,22 +805,20 @@
         <w:tc>
           <w:tcPr>
             <w:tcW w:type="dxa" w:w="5083"/>
-            <w:vAlign w:val="center"/>
             <w:tcBorders>
               <w:top w:val="single" w:sz="6" w:color="D9D9D9"/>
               <w:left w:val="single" w:sz="6" w:color="D9D9D9"/>
               <w:bottom w:val="single" w:sz="6" w:color="D9D9D9"/>
               <w:right w:val="single" w:sz="6" w:color="D9D9D9"/>
-              <w:insideH w:val="single" w:sz="6" w:color="D9D9D9"/>
-              <w:insideV w:val="single" w:sz="6" w:color="D9D9D9"/>
             </w:tcBorders>
+            <w:shd w:fill="F8FAFC"/>
             <w:tcMar>
               <w:top w:w="90" w:type="dxa"/>
-              <w:start w:w="100" w:type="dxa"/>
+              <w:left w:w="100" w:type="dxa"/>
               <w:bottom w:w="90" w:type="dxa"/>
-              <w:end w:w="100" w:type="dxa"/>
+              <w:right w:w="100" w:type="dxa"/>
             </w:tcMar>
-            <w:shd w:fill="F8FAFC"/>
+            <w:vAlign w:val="center"/>
           </w:tcPr>
           <w:p>
             <w:pPr>
@@ -886,21 +838,19 @@
         <w:tc>
           <w:tcPr>
             <w:tcW w:type="dxa" w:w="5083"/>
-            <w:vAlign w:val="center"/>
             <w:tcBorders>
               <w:top w:val="single" w:sz="6" w:color="D9D9D9"/>
               <w:left w:val="single" w:sz="6" w:color="D9D9D9"/>
               <w:bottom w:val="single" w:sz="6" w:color="D9D9D9"/>
               <w:right w:val="single" w:sz="6" w:color="D9D9D9"/>
-              <w:insideH w:val="single" w:sz="6" w:color="D9D9D9"/>
-              <w:insideV w:val="single" w:sz="6" w:color="D9D9D9"/>
             </w:tcBorders>
             <w:tcMar>
               <w:top w:w="90" w:type="dxa"/>
-              <w:start w:w="100" w:type="dxa"/>
+              <w:left w:w="100" w:type="dxa"/>
               <w:bottom w:w="90" w:type="dxa"/>
-              <w:end w:w="100" w:type="dxa"/>
+              <w:right w:w="100" w:type="dxa"/>
             </w:tcMar>
+            <w:vAlign w:val="center"/>
           </w:tcPr>
           <w:p>
             <w:pPr>
@@ -918,21 +868,19 @@
         <w:tc>
           <w:tcPr>
             <w:tcW w:type="dxa" w:w="5083"/>
-            <w:vAlign w:val="center"/>
             <w:tcBorders>
               <w:top w:val="single" w:sz="6" w:color="D9D9D9"/>
               <w:left w:val="single" w:sz="6" w:color="D9D9D9"/>
               <w:bottom w:val="single" w:sz="6" w:color="D9D9D9"/>
               <w:right w:val="single" w:sz="6" w:color="D9D9D9"/>
-              <w:insideH w:val="single" w:sz="6" w:color="D9D9D9"/>
-              <w:insideV w:val="single" w:sz="6" w:color="D9D9D9"/>
             </w:tcBorders>
             <w:tcMar>
               <w:top w:w="90" w:type="dxa"/>
-              <w:start w:w="100" w:type="dxa"/>
+              <w:left w:w="100" w:type="dxa"/>
               <w:bottom w:w="90" w:type="dxa"/>
-              <w:end w:w="100" w:type="dxa"/>
+              <w:right w:w="100" w:type="dxa"/>
             </w:tcMar>
+            <w:vAlign w:val="center"/>
           </w:tcPr>
           <w:p>
             <w:pPr>
@@ -952,22 +900,20 @@
         <w:tc>
           <w:tcPr>
             <w:tcW w:type="dxa" w:w="5083"/>
-            <w:vAlign w:val="center"/>
             <w:tcBorders>
               <w:top w:val="single" w:sz="6" w:color="D9D9D9"/>
               <w:left w:val="single" w:sz="6" w:color="D9D9D9"/>
               <w:bottom w:val="single" w:sz="6" w:color="D9D9D9"/>
               <w:right w:val="single" w:sz="6" w:color="D9D9D9"/>
-              <w:insideH w:val="single" w:sz="6" w:color="D9D9D9"/>
-              <w:insideV w:val="single" w:sz="6" w:color="D9D9D9"/>
             </w:tcBorders>
+            <w:shd w:fill="F8FAFC"/>
             <w:tcMar>
               <w:top w:w="90" w:type="dxa"/>
-              <w:start w:w="100" w:type="dxa"/>
+              <w:left w:w="100" w:type="dxa"/>
               <w:bottom w:w="90" w:type="dxa"/>
-              <w:end w:w="100" w:type="dxa"/>
+              <w:right w:w="100" w:type="dxa"/>
             </w:tcMar>
-            <w:shd w:fill="F8FAFC"/>
+            <w:vAlign w:val="center"/>
           </w:tcPr>
           <w:p>
             <w:pPr>
@@ -985,22 +931,20 @@
         <w:tc>
           <w:tcPr>
             <w:tcW w:type="dxa" w:w="5083"/>
-            <w:vAlign w:val="center"/>
             <w:tcBorders>
               <w:top w:val="single" w:sz="6" w:color="D9D9D9"/>
               <w:left w:val="single" w:sz="6" w:color="D9D9D9"/>
               <w:bottom w:val="single" w:sz="6" w:color="D9D9D9"/>
               <w:right w:val="single" w:sz="6" w:color="D9D9D9"/>
-              <w:insideH w:val="single" w:sz="6" w:color="D9D9D9"/>
-              <w:insideV w:val="single" w:sz="6" w:color="D9D9D9"/>
             </w:tcBorders>
+            <w:shd w:fill="F8FAFC"/>
             <w:tcMar>
               <w:top w:w="90" w:type="dxa"/>
-              <w:start w:w="100" w:type="dxa"/>
+              <w:left w:w="100" w:type="dxa"/>
               <w:bottom w:w="90" w:type="dxa"/>
-              <w:end w:w="100" w:type="dxa"/>
+              <w:right w:w="100" w:type="dxa"/>
             </w:tcMar>
-            <w:shd w:fill="F8FAFC"/>
+            <w:vAlign w:val="center"/>
           </w:tcPr>
           <w:p>
             <w:pPr>
@@ -1020,21 +964,19 @@
         <w:tc>
           <w:tcPr>
             <w:tcW w:type="dxa" w:w="5083"/>
-            <w:vAlign w:val="center"/>
             <w:tcBorders>
               <w:top w:val="single" w:sz="6" w:color="D9D9D9"/>
               <w:left w:val="single" w:sz="6" w:color="D9D9D9"/>
               <w:bottom w:val="single" w:sz="6" w:color="D9D9D9"/>
               <w:right w:val="single" w:sz="6" w:color="D9D9D9"/>
-              <w:insideH w:val="single" w:sz="6" w:color="D9D9D9"/>
-              <w:insideV w:val="single" w:sz="6" w:color="D9D9D9"/>
             </w:tcBorders>
             <w:tcMar>
               <w:top w:w="90" w:type="dxa"/>
-              <w:start w:w="100" w:type="dxa"/>
+              <w:left w:w="100" w:type="dxa"/>
               <w:bottom w:w="90" w:type="dxa"/>
-              <w:end w:w="100" w:type="dxa"/>
+              <w:right w:w="100" w:type="dxa"/>
             </w:tcMar>
+            <w:vAlign w:val="center"/>
           </w:tcPr>
           <w:p>
             <w:pPr>
@@ -1052,21 +994,19 @@
         <w:tc>
           <w:tcPr>
             <w:tcW w:type="dxa" w:w="5083"/>
-            <w:vAlign w:val="center"/>
             <w:tcBorders>
               <w:top w:val="single" w:sz="6" w:color="D9D9D9"/>
               <w:left w:val="single" w:sz="6" w:color="D9D9D9"/>
               <w:bottom w:val="single" w:sz="6" w:color="D9D9D9"/>
               <w:right w:val="single" w:sz="6" w:color="D9D9D9"/>
-              <w:insideH w:val="single" w:sz="6" w:color="D9D9D9"/>
-              <w:insideV w:val="single" w:sz="6" w:color="D9D9D9"/>
             </w:tcBorders>
             <w:tcMar>
               <w:top w:w="90" w:type="dxa"/>
-              <w:start w:w="100" w:type="dxa"/>
+              <w:left w:w="100" w:type="dxa"/>
               <w:bottom w:w="90" w:type="dxa"/>
-              <w:end w:w="100" w:type="dxa"/>
+              <w:right w:w="100" w:type="dxa"/>
             </w:tcMar>
+            <w:vAlign w:val="center"/>
           </w:tcPr>
           <w:p>
             <w:pPr>

</xml_diff>